<commit_message>
Add admin controls to set Pro/VIP subscriptions and demo VIP workflow
Made-with: Cursor
</commit_message>
<xml_diff>
--- a/docs-word/NovaStaris-Auth-Setup.docx
+++ b/docs-word/NovaStaris-Auth-Setup.docx
@@ -9,7 +9,7 @@
         <w:bidi w:val="false"/>
         <w:spacing w:after="120" w:before="480"/>
       </w:pPr>
-      <w:bookmarkStart w:name="_Toc_Auth_deployment_setup_1772065661193" w:id="1"/>
+      <w:bookmarkStart w:name="_Toc_Auth_deployment_setup_1772159683984" w:id="1"/>
       <w:r>
         <w:rPr>
           <w:b w:val="false"/>
@@ -33,7 +33,7 @@
         <w:bidi w:val="false"/>
         <w:spacing w:after="120" w:before="240"/>
       </w:pPr>
-      <w:bookmarkStart w:name="_Toc__1_Database_required_for_signin_1772065661196" w:id="1"/>
+      <w:bookmarkStart w:name="_Toc__1_Database_required_for_signin_1772159683984" w:id="1"/>
       <w:r>
         <w:rPr>
           <w:b w:val="false"/>
@@ -437,7 +437,7 @@
         <w:bidi w:val="false"/>
         <w:spacing w:after="120" w:before="240"/>
       </w:pPr>
-      <w:bookmarkStart w:name="_Toc__2_Google_signin_OAuth_client_was_not_fo_1772065661200" w:id="1"/>
+      <w:bookmarkStart w:name="_Toc__2_Google_signin_OAuth_client_was_not_fo_1772159683987" w:id="1"/>
       <w:r>
         <w:rPr>
           <w:b w:val="false"/>
@@ -530,7 +530,7 @@
         </w:rPr>
         <w:t xml:space="preserve">). Fix it in </w:t>
       </w:r>
-      <w:hyperlink w:history="1" r:id="rId0nopccni0ktz0txjaco0m">
+      <w:hyperlink w:history="1" r:id="rIdwba5epc0lvcw4rby6rcn0">
         <w:r>
           <w:rPr>
             <w:b w:val="false"/>
@@ -1087,7 +1087,7 @@
         <w:bidi w:val="false"/>
         <w:spacing w:after="120" w:before="240"/>
       </w:pPr>
-      <w:bookmarkStart w:name="_Toc__3_Owner_full_access_you_as_app_owner_1772065661205" w:id="1"/>
+      <w:bookmarkStart w:name="_Toc__3_Owner_full_access_you_as_app_owner_1772159683988" w:id="1"/>
       <w:r>
         <w:rPr>
           <w:b w:val="false"/>
@@ -1645,7 +1645,7 @@
         <w:bidi w:val="false"/>
         <w:spacing w:after="120" w:before="240"/>
       </w:pPr>
-      <w:bookmarkStart w:name="_Toc__4_View_customers_owner_only_1772065661207" w:id="1"/>
+      <w:bookmarkStart w:name="_Toc__4_View_customers_owner_only_1772159683989" w:id="1"/>
       <w:r>
         <w:rPr>
           <w:b w:val="false"/>
@@ -1768,7 +1768,7 @@
         <w:bidi w:val="false"/>
         <w:spacing w:after="120" w:before="240"/>
       </w:pPr>
-      <w:bookmarkStart w:name="_Toc__5_Where_is_customerdata_stored_Supabase_1772065661208" w:id="1"/>
+      <w:bookmarkStart w:name="_Toc__5_Where_is_customerdata_stored_Supabase_1772159683990" w:id="1"/>
       <w:r>
         <w:rPr>
           <w:b w:val="false"/>
@@ -1936,7 +1936,7 @@
         </w:rPr>
         <w:t xml:space="preserve">Go to </w:t>
       </w:r>
-      <w:hyperlink w:history="1" r:id="rId8ifvejishuspskoy2fuxx">
+      <w:hyperlink w:history="1" r:id="rIdajcoizkn0qqlg_oieck2k">
         <w:r>
           <w:rPr>
             <w:b w:val="false"/>

</xml_diff>